<commit_message>
Restructure project page template: reorder sections, merge payment table into pricing, move misconceptions into FAQs, rename contact label, add sample calc label
</commit_message>
<xml_diff>
--- a/godrej_parkshire.docx
+++ b/godrej_parkshire.docx
@@ -12,7 +12,25 @@
           <w:color w:val="17365D"/>
           <w:sz w:val="52"/>
         </w:rPr>
-        <w:t xml:space="preserve">Project Information Report - Godrej Parkshire </w:t>
+        <w:t xml:space="preserve">Project Information Report - Godrej </w:t>
+      </w:r>
+      <w:proofErr w:type="spellStart"/>
+      <w:r>
+        <w:rPr>
+          <w:rFonts w:cs="Calibri"/>
+          <w:color w:val="17365D"/>
+          <w:sz w:val="52"/>
+        </w:rPr>
+        <w:t>Parkshire</w:t>
+      </w:r>
+      <w:proofErr w:type="spellEnd"/>
+      <w:r>
+        <w:rPr>
+          <w:rFonts w:cs="Calibri"/>
+          <w:color w:val="17365D"/>
+          <w:sz w:val="52"/>
+        </w:rPr>
+        <w:t xml:space="preserve"> </w:t>
       </w:r>
     </w:p>
     <w:p>
@@ -161,7 +179,21 @@
         <w:rPr>
           <w:rFonts w:ascii="Cambria" w:eastAsia="Cambria" w:hAnsi="Cambria" w:cs="Cambria"/>
         </w:rPr>
-        <w:t xml:space="preserve"> Under Construction , Basement Stage </w:t>
+        <w:t xml:space="preserve"> Under </w:t>
+      </w:r>
+      <w:proofErr w:type="gramStart"/>
+      <w:r>
+        <w:rPr>
+          <w:rFonts w:ascii="Cambria" w:eastAsia="Cambria" w:hAnsi="Cambria" w:cs="Cambria"/>
+        </w:rPr>
+        <w:t>Construction ,</w:t>
+      </w:r>
+      <w:proofErr w:type="gramEnd"/>
+      <w:r>
+        <w:rPr>
+          <w:rFonts w:ascii="Cambria" w:eastAsia="Cambria" w:hAnsi="Cambria" w:cs="Cambria"/>
+        </w:rPr>
+        <w:t xml:space="preserve"> Basement Stage </w:t>
       </w:r>
     </w:p>
     <w:p>
@@ -184,7 +216,15 @@
         <w:ind w:left="-5"/>
       </w:pPr>
       <w:r>
-        <w:t xml:space="preserve">2. Configurations (all of them) &amp; Pricing (in crs.) </w:t>
+        <w:t xml:space="preserve">2. Configurations (all of them) &amp; Pricing (in </w:t>
+      </w:r>
+      <w:proofErr w:type="spellStart"/>
+      <w:r>
+        <w:t>crs</w:t>
+      </w:r>
+      <w:proofErr w:type="spellEnd"/>
+      <w:r>
+        <w:t xml:space="preserve">.) </w:t>
       </w:r>
     </w:p>
     <w:tbl>
@@ -195,8 +235,6 @@
         <w:tblCellMar>
           <w:top w:w="73" w:type="dxa"/>
           <w:left w:w="7" w:type="dxa"/>
-          <w:bottom w:w="0" w:type="dxa"/>
-          <w:right w:w="0" w:type="dxa"/>
         </w:tblCellMar>
         <w:tblLook w:val="04A0" w:firstRow="1" w:lastRow="0" w:firstColumn="1" w:lastColumn="0" w:noHBand="0" w:noVBand="1"/>
       </w:tblPr>
@@ -223,7 +261,6 @@
           </w:tcPr>
           <w:p>
             <w:pPr>
-              <w:spacing w:after="0"/>
               <w:ind w:left="38"/>
               <w:jc w:val="both"/>
             </w:pPr>
@@ -248,7 +285,6 @@
           </w:tcPr>
           <w:p>
             <w:pPr>
-              <w:spacing w:after="0"/>
               <w:ind w:left="38"/>
             </w:pPr>
             <w:r>
@@ -261,7 +297,6 @@
           </w:p>
           <w:p>
             <w:pPr>
-              <w:spacing w:after="0"/>
               <w:ind w:left="38"/>
             </w:pPr>
             <w:r>
@@ -285,7 +320,6 @@
           </w:tcPr>
           <w:p>
             <w:pPr>
-              <w:spacing w:after="0"/>
               <w:ind w:left="36"/>
             </w:pPr>
             <w:r>
@@ -298,7 +332,6 @@
           </w:p>
           <w:p>
             <w:pPr>
-              <w:spacing w:after="0"/>
               <w:ind w:left="36"/>
             </w:pPr>
             <w:r>
@@ -322,7 +355,6 @@
           </w:tcPr>
           <w:p>
             <w:pPr>
-              <w:spacing w:after="0"/>
               <w:ind w:left="38"/>
             </w:pPr>
             <w:r>
@@ -335,7 +367,6 @@
           </w:p>
           <w:p>
             <w:pPr>
-              <w:spacing w:after="0"/>
               <w:ind w:left="38"/>
               <w:jc w:val="both"/>
             </w:pPr>
@@ -359,9 +390,6 @@
             </w:tcBorders>
           </w:tcPr>
           <w:p>
-            <w:pPr>
-              <w:spacing w:after="0"/>
-            </w:pPr>
             <w:r>
               <w:rPr>
                 <w:rFonts w:ascii="Cambria" w:eastAsia="Cambria" w:hAnsi="Cambria" w:cs="Cambria"/>
@@ -388,7 +416,6 @@
           </w:tcPr>
           <w:p>
             <w:pPr>
-              <w:spacing w:after="0"/>
               <w:ind w:left="38"/>
             </w:pPr>
             <w:r>
@@ -400,7 +427,6 @@
           </w:p>
           <w:p>
             <w:pPr>
-              <w:spacing w:after="0"/>
               <w:ind w:left="38"/>
             </w:pPr>
             <w:r>
@@ -423,7 +449,6 @@
           </w:tcPr>
           <w:p>
             <w:pPr>
-              <w:spacing w:after="0"/>
               <w:ind w:right="44"/>
               <w:jc w:val="right"/>
             </w:pPr>
@@ -447,7 +472,6 @@
           </w:tcPr>
           <w:p>
             <w:pPr>
-              <w:spacing w:after="0"/>
               <w:ind w:left="36"/>
             </w:pPr>
             <w:r>
@@ -471,7 +495,6 @@
           </w:tcPr>
           <w:p>
             <w:pPr>
-              <w:spacing w:after="0"/>
               <w:ind w:left="38"/>
             </w:pPr>
             <w:r>
@@ -493,9 +516,6 @@
             </w:tcBorders>
           </w:tcPr>
           <w:p>
-            <w:pPr>
-              <w:spacing w:after="0"/>
-            </w:pPr>
             <w:r>
               <w:rPr>
                 <w:rFonts w:ascii="Cambria" w:eastAsia="Cambria" w:hAnsi="Cambria" w:cs="Cambria"/>
@@ -521,7 +541,6 @@
           </w:tcPr>
           <w:p>
             <w:pPr>
-              <w:spacing w:after="0"/>
               <w:ind w:left="38"/>
             </w:pPr>
             <w:r>
@@ -544,7 +563,6 @@
           </w:tcPr>
           <w:p>
             <w:pPr>
-              <w:spacing w:after="0"/>
               <w:ind w:right="44"/>
               <w:jc w:val="right"/>
             </w:pPr>
@@ -568,7 +586,6 @@
           </w:tcPr>
           <w:p>
             <w:pPr>
-              <w:spacing w:after="0"/>
               <w:ind w:left="36"/>
             </w:pPr>
             <w:r>
@@ -591,7 +608,6 @@
           </w:tcPr>
           <w:p>
             <w:pPr>
-              <w:spacing w:after="0"/>
               <w:ind w:left="38"/>
             </w:pPr>
             <w:r>
@@ -613,9 +629,6 @@
             </w:tcBorders>
           </w:tcPr>
           <w:p>
-            <w:pPr>
-              <w:spacing w:after="0"/>
-            </w:pPr>
             <w:r>
               <w:rPr>
                 <w:rFonts w:ascii="Cambria" w:eastAsia="Cambria" w:hAnsi="Cambria" w:cs="Cambria"/>
@@ -641,7 +654,6 @@
           </w:tcPr>
           <w:p>
             <w:pPr>
-              <w:spacing w:after="0"/>
               <w:ind w:left="38"/>
             </w:pPr>
             <w:r>
@@ -653,7 +665,6 @@
           </w:p>
           <w:p>
             <w:pPr>
-              <w:spacing w:after="0"/>
               <w:ind w:left="38"/>
             </w:pPr>
             <w:r>
@@ -676,7 +687,6 @@
           </w:tcPr>
           <w:p>
             <w:pPr>
-              <w:spacing w:after="0"/>
               <w:ind w:right="44"/>
               <w:jc w:val="right"/>
             </w:pPr>
@@ -700,7 +710,6 @@
           </w:tcPr>
           <w:p>
             <w:pPr>
-              <w:spacing w:after="0"/>
               <w:ind w:left="36"/>
             </w:pPr>
             <w:r>
@@ -723,7 +732,6 @@
           </w:tcPr>
           <w:p>
             <w:pPr>
-              <w:spacing w:after="0"/>
               <w:ind w:left="38"/>
             </w:pPr>
             <w:r>
@@ -745,9 +753,6 @@
             </w:tcBorders>
           </w:tcPr>
           <w:p>
-            <w:pPr>
-              <w:spacing w:after="0"/>
-            </w:pPr>
             <w:r>
               <w:rPr>
                 <w:rFonts w:ascii="Cambria" w:eastAsia="Cambria" w:hAnsi="Cambria" w:cs="Cambria"/>
@@ -773,7 +778,6 @@
           </w:tcPr>
           <w:p>
             <w:pPr>
-              <w:spacing w:after="0"/>
               <w:ind w:left="38"/>
             </w:pPr>
             <w:r>
@@ -796,7 +800,6 @@
           </w:tcPr>
           <w:p>
             <w:pPr>
-              <w:spacing w:after="0"/>
               <w:ind w:right="44"/>
               <w:jc w:val="right"/>
             </w:pPr>
@@ -820,7 +823,6 @@
           </w:tcPr>
           <w:p>
             <w:pPr>
-              <w:spacing w:after="0"/>
               <w:ind w:left="36"/>
             </w:pPr>
             <w:r>
@@ -843,7 +845,6 @@
           </w:tcPr>
           <w:p>
             <w:pPr>
-              <w:spacing w:after="0"/>
               <w:ind w:left="38"/>
             </w:pPr>
             <w:r>
@@ -865,9 +866,6 @@
             </w:tcBorders>
           </w:tcPr>
           <w:p>
-            <w:pPr>
-              <w:spacing w:after="0"/>
-            </w:pPr>
             <w:r>
               <w:rPr>
                 <w:rFonts w:ascii="Cambria" w:eastAsia="Cambria" w:hAnsi="Cambria" w:cs="Cambria"/>
@@ -991,7 +989,23 @@
           <w:rFonts w:ascii="Cambria" w:eastAsia="Cambria" w:hAnsi="Cambria" w:cs="Cambria"/>
           <w:b/>
         </w:rPr>
-        <w:t xml:space="preserve">Possession Timeline As Per RERA (Month and Year): </w:t>
+        <w:t xml:space="preserve">Possession Timeline </w:t>
+      </w:r>
+      <w:proofErr w:type="gramStart"/>
+      <w:r>
+        <w:rPr>
+          <w:rFonts w:ascii="Cambria" w:eastAsia="Cambria" w:hAnsi="Cambria" w:cs="Cambria"/>
+          <w:b/>
+        </w:rPr>
+        <w:t>As</w:t>
+      </w:r>
+      <w:proofErr w:type="gramEnd"/>
+      <w:r>
+        <w:rPr>
+          <w:rFonts w:ascii="Cambria" w:eastAsia="Cambria" w:hAnsi="Cambria" w:cs="Cambria"/>
+          <w:b/>
+        </w:rPr>
+        <w:t xml:space="preserve"> Per RERA (Month and Year): </w:t>
       </w:r>
       <w:r>
         <w:rPr>
@@ -1014,7 +1028,23 @@
           <w:rFonts w:ascii="Cambria" w:eastAsia="Cambria" w:hAnsi="Cambria" w:cs="Cambria"/>
           <w:b/>
         </w:rPr>
-        <w:t>Possession Timeline Target As Per GPL (Month and Year):</w:t>
+        <w:t xml:space="preserve">Possession Timeline Target </w:t>
+      </w:r>
+      <w:proofErr w:type="gramStart"/>
+      <w:r>
+        <w:rPr>
+          <w:rFonts w:ascii="Cambria" w:eastAsia="Cambria" w:hAnsi="Cambria" w:cs="Cambria"/>
+          <w:b/>
+        </w:rPr>
+        <w:t>As</w:t>
+      </w:r>
+      <w:proofErr w:type="gramEnd"/>
+      <w:r>
+        <w:rPr>
+          <w:rFonts w:ascii="Cambria" w:eastAsia="Cambria" w:hAnsi="Cambria" w:cs="Cambria"/>
+          <w:b/>
+        </w:rPr>
+        <w:t xml:space="preserve"> Per GPL (Month and Year):</w:t>
       </w:r>
       <w:r>
         <w:rPr>
@@ -1037,7 +1067,23 @@
           <w:rFonts w:ascii="Cambria" w:eastAsia="Cambria" w:hAnsi="Cambria" w:cs="Cambria"/>
           <w:b/>
         </w:rPr>
-        <w:t xml:space="preserve">OC Timeline As Per RERA (Month and Year): </w:t>
+        <w:t xml:space="preserve">OC Timeline </w:t>
+      </w:r>
+      <w:proofErr w:type="gramStart"/>
+      <w:r>
+        <w:rPr>
+          <w:rFonts w:ascii="Cambria" w:eastAsia="Cambria" w:hAnsi="Cambria" w:cs="Cambria"/>
+          <w:b/>
+        </w:rPr>
+        <w:t>As</w:t>
+      </w:r>
+      <w:proofErr w:type="gramEnd"/>
+      <w:r>
+        <w:rPr>
+          <w:rFonts w:ascii="Cambria" w:eastAsia="Cambria" w:hAnsi="Cambria" w:cs="Cambria"/>
+          <w:b/>
+        </w:rPr>
+        <w:t xml:space="preserve"> Per RERA (Month and Year): </w:t>
       </w:r>
       <w:r>
         <w:rPr>
@@ -1060,7 +1106,23 @@
           <w:rFonts w:ascii="Cambria" w:eastAsia="Cambria" w:hAnsi="Cambria" w:cs="Cambria"/>
           <w:b/>
         </w:rPr>
-        <w:t>OC Timeline Target As Per GPL (Month and Year):</w:t>
+        <w:t xml:space="preserve">OC Timeline Target </w:t>
+      </w:r>
+      <w:proofErr w:type="gramStart"/>
+      <w:r>
+        <w:rPr>
+          <w:rFonts w:ascii="Cambria" w:eastAsia="Cambria" w:hAnsi="Cambria" w:cs="Cambria"/>
+          <w:b/>
+        </w:rPr>
+        <w:t>As</w:t>
+      </w:r>
+      <w:proofErr w:type="gramEnd"/>
+      <w:r>
+        <w:rPr>
+          <w:rFonts w:ascii="Cambria" w:eastAsia="Cambria" w:hAnsi="Cambria" w:cs="Cambria"/>
+          <w:b/>
+        </w:rPr>
+        <w:t xml:space="preserve"> Per GPL (Month and Year):</w:t>
       </w:r>
       <w:r>
         <w:rPr>
@@ -1182,7 +1244,23 @@
           <w:rFonts w:ascii="Cambria" w:eastAsia="Cambria" w:hAnsi="Cambria" w:cs="Cambria"/>
           <w:b/>
         </w:rPr>
-        <w:t xml:space="preserve">Total Cost For Customer </w:t>
+        <w:t xml:space="preserve">Total Cost </w:t>
+      </w:r>
+      <w:proofErr w:type="gramStart"/>
+      <w:r>
+        <w:rPr>
+          <w:rFonts w:ascii="Cambria" w:eastAsia="Cambria" w:hAnsi="Cambria" w:cs="Cambria"/>
+          <w:b/>
+        </w:rPr>
+        <w:t>For</w:t>
+      </w:r>
+      <w:proofErr w:type="gramEnd"/>
+      <w:r>
+        <w:rPr>
+          <w:rFonts w:ascii="Cambria" w:eastAsia="Cambria" w:hAnsi="Cambria" w:cs="Cambria"/>
+          <w:b/>
+        </w:rPr>
+        <w:t xml:space="preserve"> Customer </w:t>
       </w:r>
       <w:r>
         <w:rPr>
@@ -1295,7 +1373,6 @@
         <w:tblCellMar>
           <w:top w:w="52" w:type="dxa"/>
           <w:left w:w="107" w:type="dxa"/>
-          <w:bottom w:w="0" w:type="dxa"/>
           <w:right w:w="59" w:type="dxa"/>
         </w:tblCellMar>
         <w:tblLook w:val="04A0" w:firstRow="1" w:lastRow="0" w:firstColumn="1" w:lastColumn="0" w:noHBand="0" w:noVBand="1"/>
@@ -1324,7 +1401,6 @@
           </w:tcPr>
           <w:p>
             <w:pPr>
-              <w:spacing w:after="0"/>
               <w:ind w:right="28"/>
               <w:jc w:val="center"/>
             </w:pPr>
@@ -1351,7 +1427,6 @@
           </w:tcPr>
           <w:p>
             <w:pPr>
-              <w:spacing w:after="0"/>
               <w:ind w:right="27"/>
               <w:jc w:val="center"/>
             </w:pPr>
@@ -1377,7 +1452,6 @@
           </w:tcPr>
           <w:p>
             <w:pPr>
-              <w:spacing w:after="0"/>
               <w:ind w:left="37"/>
             </w:pPr>
             <w:r>
@@ -1390,16 +1464,24 @@
           </w:p>
           <w:p>
             <w:pPr>
-              <w:spacing w:after="0"/>
               <w:ind w:right="30"/>
               <w:jc w:val="center"/>
             </w:pPr>
+            <w:proofErr w:type="spellStart"/>
             <w:r>
               <w:rPr>
                 <w:rFonts w:ascii="Cambria" w:eastAsia="Cambria" w:hAnsi="Cambria" w:cs="Cambria"/>
                 <w:b/>
               </w:rPr>
-              <w:t xml:space="preserve">sqft </w:t>
+              <w:t>sqft</w:t>
+            </w:r>
+            <w:proofErr w:type="spellEnd"/>
+            <w:r>
+              <w:rPr>
+                <w:rFonts w:ascii="Cambria" w:eastAsia="Cambria" w:hAnsi="Cambria" w:cs="Cambria"/>
+                <w:b/>
+              </w:rPr>
+              <w:t xml:space="preserve"> </w:t>
             </w:r>
           </w:p>
         </w:tc>
@@ -1417,7 +1499,6 @@
           </w:tcPr>
           <w:p>
             <w:pPr>
-              <w:spacing w:after="0"/>
               <w:ind w:right="23"/>
               <w:jc w:val="center"/>
             </w:pPr>
@@ -1448,7 +1529,6 @@
           </w:tcPr>
           <w:p>
             <w:pPr>
-              <w:spacing w:after="0"/>
               <w:ind w:right="30"/>
               <w:jc w:val="center"/>
             </w:pPr>
@@ -1473,7 +1553,6 @@
           </w:tcPr>
           <w:p>
             <w:pPr>
-              <w:spacing w:after="0"/>
               <w:ind w:right="29"/>
               <w:jc w:val="center"/>
             </w:pPr>
@@ -1498,7 +1577,6 @@
           </w:tcPr>
           <w:p>
             <w:pPr>
-              <w:spacing w:after="0"/>
               <w:ind w:right="25"/>
               <w:jc w:val="center"/>
             </w:pPr>
@@ -1522,7 +1600,7 @@
           </w:tcPr>
           <w:p>
             <w:pPr>
-              <w:spacing w:after="0" w:line="239" w:lineRule="auto"/>
+              <w:spacing w:line="239" w:lineRule="auto"/>
             </w:pPr>
             <w:r>
               <w:rPr>
@@ -1532,9 +1610,6 @@
             </w:r>
           </w:p>
           <w:p>
-            <w:pPr>
-              <w:spacing w:after="0"/>
-            </w:pPr>
             <w:r>
               <w:rPr>
                 <w:rFonts w:ascii="Cambria" w:eastAsia="Cambria" w:hAnsi="Cambria" w:cs="Cambria"/>
@@ -1561,7 +1636,6 @@
           </w:tcPr>
           <w:p>
             <w:pPr>
-              <w:spacing w:after="0"/>
               <w:ind w:right="31"/>
               <w:jc w:val="center"/>
             </w:pPr>
@@ -1586,7 +1660,6 @@
           </w:tcPr>
           <w:p>
             <w:pPr>
-              <w:spacing w:after="0"/>
               <w:ind w:right="29"/>
               <w:jc w:val="center"/>
             </w:pPr>
@@ -1611,7 +1684,6 @@
           </w:tcPr>
           <w:p>
             <w:pPr>
-              <w:spacing w:after="0"/>
               <w:ind w:right="25"/>
               <w:jc w:val="center"/>
             </w:pPr>
@@ -1635,7 +1707,7 @@
           </w:tcPr>
           <w:p>
             <w:pPr>
-              <w:spacing w:after="0" w:line="239" w:lineRule="auto"/>
+              <w:spacing w:line="239" w:lineRule="auto"/>
             </w:pPr>
             <w:r>
               <w:rPr>
@@ -1645,9 +1717,6 @@
             </w:r>
           </w:p>
           <w:p>
-            <w:pPr>
-              <w:spacing w:after="0"/>
-            </w:pPr>
             <w:r>
               <w:rPr>
                 <w:rFonts w:ascii="Cambria" w:eastAsia="Cambria" w:hAnsi="Cambria" w:cs="Cambria"/>
@@ -1674,7 +1743,6 @@
           </w:tcPr>
           <w:p>
             <w:pPr>
-              <w:spacing w:after="0"/>
               <w:jc w:val="center"/>
             </w:pPr>
             <w:r>
@@ -1698,7 +1766,6 @@
           </w:tcPr>
           <w:p>
             <w:pPr>
-              <w:spacing w:after="0"/>
               <w:ind w:left="82"/>
             </w:pPr>
             <w:r>
@@ -1722,7 +1789,6 @@
           </w:tcPr>
           <w:p>
             <w:pPr>
-              <w:spacing w:after="0"/>
               <w:ind w:right="25"/>
               <w:jc w:val="center"/>
             </w:pPr>
@@ -1745,9 +1811,6 @@
             </w:tcBorders>
           </w:tcPr>
           <w:p>
-            <w:pPr>
-              <w:spacing w:after="0"/>
-            </w:pPr>
             <w:r>
               <w:rPr>
                 <w:rFonts w:ascii="Cambria" w:eastAsia="Cambria" w:hAnsi="Cambria" w:cs="Cambria"/>
@@ -1756,9 +1819,6 @@
             </w:r>
           </w:p>
           <w:p>
-            <w:pPr>
-              <w:spacing w:after="0"/>
-            </w:pPr>
             <w:r>
               <w:rPr>
                 <w:rFonts w:ascii="Cambria" w:eastAsia="Cambria" w:hAnsi="Cambria" w:cs="Cambria"/>
@@ -1767,9 +1827,6 @@
             </w:r>
           </w:p>
           <w:p>
-            <w:pPr>
-              <w:spacing w:after="0"/>
-            </w:pPr>
             <w:r>
               <w:rPr>
                 <w:rFonts w:ascii="Cambria" w:eastAsia="Cambria" w:hAnsi="Cambria" w:cs="Cambria"/>
@@ -1796,7 +1853,6 @@
           </w:tcPr>
           <w:p>
             <w:pPr>
-              <w:spacing w:after="0"/>
               <w:ind w:right="29"/>
               <w:jc w:val="center"/>
             </w:pPr>
@@ -1821,7 +1877,6 @@
           </w:tcPr>
           <w:p>
             <w:pPr>
-              <w:spacing w:after="0"/>
               <w:ind w:right="29"/>
               <w:jc w:val="center"/>
             </w:pPr>
@@ -1846,7 +1901,6 @@
           </w:tcPr>
           <w:p>
             <w:pPr>
-              <w:spacing w:after="0"/>
               <w:ind w:right="25"/>
               <w:jc w:val="center"/>
             </w:pPr>
@@ -1870,7 +1924,7 @@
           </w:tcPr>
           <w:p>
             <w:pPr>
-              <w:spacing w:after="0" w:line="239" w:lineRule="auto"/>
+              <w:spacing w:line="239" w:lineRule="auto"/>
             </w:pPr>
             <w:r>
               <w:rPr>
@@ -1880,9 +1934,6 @@
             </w:r>
           </w:p>
           <w:p>
-            <w:pPr>
-              <w:spacing w:after="0"/>
-            </w:pPr>
             <w:r>
               <w:rPr>
                 <w:rFonts w:ascii="Cambria" w:eastAsia="Cambria" w:hAnsi="Cambria" w:cs="Cambria"/>
@@ -1909,7 +1960,6 @@
           </w:tcPr>
           <w:p>
             <w:pPr>
-              <w:spacing w:after="0"/>
               <w:ind w:right="27"/>
               <w:jc w:val="center"/>
             </w:pPr>
@@ -1934,7 +1984,6 @@
           </w:tcPr>
           <w:p>
             <w:pPr>
-              <w:spacing w:after="0"/>
               <w:ind w:right="29"/>
               <w:jc w:val="center"/>
             </w:pPr>
@@ -1959,7 +2008,6 @@
           </w:tcPr>
           <w:p>
             <w:pPr>
-              <w:spacing w:after="0"/>
               <w:ind w:right="25"/>
               <w:jc w:val="center"/>
             </w:pPr>
@@ -1983,7 +2031,7 @@
           </w:tcPr>
           <w:p>
             <w:pPr>
-              <w:spacing w:after="0" w:line="239" w:lineRule="auto"/>
+              <w:spacing w:line="239" w:lineRule="auto"/>
             </w:pPr>
             <w:r>
               <w:rPr>
@@ -1993,9 +2041,6 @@
             </w:r>
           </w:p>
           <w:p>
-            <w:pPr>
-              <w:spacing w:after="0"/>
-            </w:pPr>
             <w:r>
               <w:rPr>
                 <w:rFonts w:ascii="Cambria" w:eastAsia="Cambria" w:hAnsi="Cambria" w:cs="Cambria"/>
@@ -2022,7 +2067,6 @@
           </w:tcPr>
           <w:p>
             <w:pPr>
-              <w:spacing w:after="0"/>
               <w:ind w:right="29"/>
               <w:jc w:val="center"/>
             </w:pPr>
@@ -2047,7 +2091,6 @@
           </w:tcPr>
           <w:p>
             <w:pPr>
-              <w:spacing w:after="0"/>
               <w:ind w:right="29"/>
               <w:jc w:val="center"/>
             </w:pPr>
@@ -2072,7 +2115,6 @@
           </w:tcPr>
           <w:p>
             <w:pPr>
-              <w:spacing w:after="0"/>
               <w:ind w:right="25"/>
               <w:jc w:val="center"/>
             </w:pPr>
@@ -2096,7 +2138,7 @@
           </w:tcPr>
           <w:p>
             <w:pPr>
-              <w:spacing w:after="0" w:line="236" w:lineRule="auto"/>
+              <w:spacing w:line="236" w:lineRule="auto"/>
             </w:pPr>
             <w:r>
               <w:rPr>
@@ -2106,9 +2148,6 @@
             </w:r>
           </w:p>
           <w:p>
-            <w:pPr>
-              <w:spacing w:after="0"/>
-            </w:pPr>
             <w:r>
               <w:rPr>
                 <w:rFonts w:ascii="Cambria" w:eastAsia="Cambria" w:hAnsi="Cambria" w:cs="Cambria"/>
@@ -2135,7 +2174,6 @@
           </w:tcPr>
           <w:p>
             <w:pPr>
-              <w:spacing w:after="0"/>
               <w:ind w:right="30"/>
               <w:jc w:val="center"/>
             </w:pPr>
@@ -2160,7 +2198,6 @@
           </w:tcPr>
           <w:p>
             <w:pPr>
-              <w:spacing w:after="0"/>
               <w:ind w:right="29"/>
               <w:jc w:val="center"/>
             </w:pPr>
@@ -2185,7 +2222,6 @@
           </w:tcPr>
           <w:p>
             <w:pPr>
-              <w:spacing w:after="0"/>
               <w:ind w:right="25"/>
               <w:jc w:val="center"/>
             </w:pPr>
@@ -2219,9 +2255,6 @@
             </w:r>
           </w:p>
           <w:p>
-            <w:pPr>
-              <w:spacing w:after="0"/>
-            </w:pPr>
             <w:r>
               <w:rPr>
                 <w:rFonts w:ascii="Cambria" w:eastAsia="Cambria" w:hAnsi="Cambria" w:cs="Cambria"/>
@@ -2248,7 +2281,6 @@
           </w:tcPr>
           <w:p>
             <w:pPr>
-              <w:spacing w:after="0"/>
               <w:ind w:right="32"/>
               <w:jc w:val="center"/>
             </w:pPr>
@@ -2273,7 +2305,6 @@
           </w:tcPr>
           <w:p>
             <w:pPr>
-              <w:spacing w:after="0"/>
               <w:ind w:right="29"/>
               <w:jc w:val="center"/>
             </w:pPr>
@@ -2298,7 +2329,6 @@
           </w:tcPr>
           <w:p>
             <w:pPr>
-              <w:spacing w:after="0"/>
               <w:ind w:right="25"/>
               <w:jc w:val="center"/>
             </w:pPr>
@@ -2332,9 +2362,6 @@
             </w:r>
           </w:p>
           <w:p>
-            <w:pPr>
-              <w:spacing w:after="0"/>
-            </w:pPr>
             <w:r>
               <w:rPr>
                 <w:rFonts w:ascii="Cambria" w:eastAsia="Cambria" w:hAnsi="Cambria" w:cs="Cambria"/>
@@ -2361,7 +2388,6 @@
           </w:tcPr>
           <w:p>
             <w:pPr>
-              <w:spacing w:after="0"/>
               <w:ind w:right="29"/>
               <w:jc w:val="center"/>
             </w:pPr>
@@ -2386,7 +2412,6 @@
           </w:tcPr>
           <w:p>
             <w:pPr>
-              <w:spacing w:after="0"/>
               <w:ind w:right="29"/>
               <w:jc w:val="center"/>
             </w:pPr>
@@ -2411,7 +2436,6 @@
           </w:tcPr>
           <w:p>
             <w:pPr>
-              <w:spacing w:after="0"/>
               <w:ind w:right="25"/>
               <w:jc w:val="center"/>
             </w:pPr>
@@ -2445,9 +2469,6 @@
             </w:r>
           </w:p>
           <w:p>
-            <w:pPr>
-              <w:spacing w:after="0"/>
-            </w:pPr>
             <w:r>
               <w:rPr>
                 <w:rFonts w:ascii="Cambria" w:eastAsia="Cambria" w:hAnsi="Cambria" w:cs="Cambria"/>
@@ -2474,7 +2495,6 @@
           </w:tcPr>
           <w:p>
             <w:pPr>
-              <w:spacing w:after="0"/>
               <w:ind w:right="26"/>
               <w:jc w:val="center"/>
             </w:pPr>
@@ -2499,7 +2519,6 @@
           </w:tcPr>
           <w:p>
             <w:pPr>
-              <w:spacing w:after="0"/>
               <w:ind w:right="29"/>
               <w:jc w:val="center"/>
             </w:pPr>
@@ -2524,7 +2543,6 @@
           </w:tcPr>
           <w:p>
             <w:pPr>
-              <w:spacing w:after="0"/>
               <w:ind w:right="25"/>
               <w:jc w:val="center"/>
             </w:pPr>
@@ -2558,9 +2576,6 @@
             </w:r>
           </w:p>
           <w:p>
-            <w:pPr>
-              <w:spacing w:after="0"/>
-            </w:pPr>
             <w:r>
               <w:rPr>
                 <w:rFonts w:ascii="Cambria" w:eastAsia="Cambria" w:hAnsi="Cambria" w:cs="Cambria"/>
@@ -2587,7 +2602,6 @@
           </w:tcPr>
           <w:p>
             <w:pPr>
-              <w:spacing w:after="0"/>
               <w:ind w:right="29"/>
               <w:jc w:val="center"/>
             </w:pPr>
@@ -2612,7 +2626,6 @@
           </w:tcPr>
           <w:p>
             <w:pPr>
-              <w:spacing w:after="0"/>
               <w:ind w:right="29"/>
               <w:jc w:val="center"/>
             </w:pPr>
@@ -2637,7 +2650,6 @@
           </w:tcPr>
           <w:p>
             <w:pPr>
-              <w:spacing w:after="0"/>
               <w:ind w:right="25"/>
               <w:jc w:val="center"/>
             </w:pPr>
@@ -2671,9 +2683,6 @@
             </w:r>
           </w:p>
           <w:p>
-            <w:pPr>
-              <w:spacing w:after="0"/>
-            </w:pPr>
             <w:r>
               <w:rPr>
                 <w:rFonts w:ascii="Cambria" w:eastAsia="Cambria" w:hAnsi="Cambria" w:cs="Cambria"/>
@@ -2700,7 +2709,6 @@
           </w:tcPr>
           <w:p>
             <w:pPr>
-              <w:spacing w:after="0"/>
               <w:ind w:right="27"/>
               <w:jc w:val="center"/>
             </w:pPr>
@@ -2725,7 +2733,6 @@
           </w:tcPr>
           <w:p>
             <w:pPr>
-              <w:spacing w:after="0"/>
               <w:ind w:right="29"/>
               <w:jc w:val="center"/>
             </w:pPr>
@@ -2750,7 +2757,6 @@
           </w:tcPr>
           <w:p>
             <w:pPr>
-              <w:spacing w:after="0"/>
               <w:ind w:right="25"/>
               <w:jc w:val="center"/>
             </w:pPr>
@@ -2784,9 +2790,6 @@
             </w:r>
           </w:p>
           <w:p>
-            <w:pPr>
-              <w:spacing w:after="0"/>
-            </w:pPr>
             <w:r>
               <w:rPr>
                 <w:rFonts w:ascii="Cambria" w:eastAsia="Cambria" w:hAnsi="Cambria" w:cs="Cambria"/>
@@ -2813,7 +2816,6 @@
           </w:tcPr>
           <w:p>
             <w:pPr>
-              <w:spacing w:after="0"/>
               <w:ind w:right="32"/>
               <w:jc w:val="center"/>
             </w:pPr>
@@ -2839,7 +2841,6 @@
           </w:tcPr>
           <w:p>
             <w:pPr>
-              <w:spacing w:after="0"/>
               <w:ind w:right="29"/>
               <w:jc w:val="center"/>
             </w:pPr>
@@ -2864,7 +2865,6 @@
           </w:tcPr>
           <w:p>
             <w:pPr>
-              <w:spacing w:after="0"/>
               <w:ind w:right="25"/>
               <w:jc w:val="center"/>
             </w:pPr>
@@ -2898,9 +2898,6 @@
             </w:r>
           </w:p>
           <w:p>
-            <w:pPr>
-              <w:spacing w:after="0"/>
-            </w:pPr>
             <w:r>
               <w:rPr>
                 <w:rFonts w:ascii="Cambria" w:eastAsia="Cambria" w:hAnsi="Cambria" w:cs="Cambria"/>
@@ -2927,7 +2924,6 @@
           </w:tcPr>
           <w:p>
             <w:pPr>
-              <w:spacing w:after="0"/>
               <w:ind w:right="29"/>
               <w:jc w:val="center"/>
             </w:pPr>
@@ -2952,7 +2948,6 @@
           </w:tcPr>
           <w:p>
             <w:pPr>
-              <w:spacing w:after="0"/>
               <w:ind w:right="29"/>
               <w:jc w:val="center"/>
             </w:pPr>
@@ -2977,7 +2972,6 @@
           </w:tcPr>
           <w:p>
             <w:pPr>
-              <w:spacing w:after="0"/>
               <w:ind w:right="25"/>
               <w:jc w:val="center"/>
             </w:pPr>
@@ -3001,7 +2995,7 @@
           </w:tcPr>
           <w:p>
             <w:pPr>
-              <w:spacing w:after="0" w:line="239" w:lineRule="auto"/>
+              <w:spacing w:line="239" w:lineRule="auto"/>
             </w:pPr>
             <w:r>
               <w:rPr>
@@ -3011,9 +3005,6 @@
             </w:r>
           </w:p>
           <w:p>
-            <w:pPr>
-              <w:spacing w:after="0"/>
-            </w:pPr>
             <w:r>
               <w:rPr>
                 <w:rFonts w:ascii="Cambria" w:eastAsia="Cambria" w:hAnsi="Cambria" w:cs="Cambria"/>
@@ -3040,7 +3031,6 @@
           </w:tcPr>
           <w:p>
             <w:pPr>
-              <w:spacing w:after="0"/>
               <w:ind w:right="51"/>
               <w:jc w:val="center"/>
             </w:pPr>
@@ -3065,7 +3055,6 @@
           </w:tcPr>
           <w:p>
             <w:pPr>
-              <w:spacing w:after="0"/>
               <w:ind w:right="49"/>
               <w:jc w:val="center"/>
             </w:pPr>
@@ -3090,7 +3079,6 @@
           </w:tcPr>
           <w:p>
             <w:pPr>
-              <w:spacing w:after="0"/>
               <w:ind w:right="43"/>
               <w:jc w:val="center"/>
             </w:pPr>
@@ -3114,7 +3102,7 @@
           </w:tcPr>
           <w:p>
             <w:pPr>
-              <w:spacing w:after="0" w:line="239" w:lineRule="auto"/>
+              <w:spacing w:line="239" w:lineRule="auto"/>
               <w:ind w:left="4"/>
             </w:pPr>
             <w:r>
@@ -3126,7 +3114,6 @@
           </w:p>
           <w:p>
             <w:pPr>
-              <w:spacing w:after="0"/>
               <w:ind w:left="4"/>
             </w:pPr>
             <w:r>
@@ -3155,7 +3142,6 @@
           </w:tcPr>
           <w:p>
             <w:pPr>
-              <w:spacing w:after="0"/>
               <w:ind w:right="49"/>
               <w:jc w:val="center"/>
             </w:pPr>
@@ -3180,7 +3166,6 @@
           </w:tcPr>
           <w:p>
             <w:pPr>
-              <w:spacing w:after="0"/>
               <w:ind w:right="49"/>
               <w:jc w:val="center"/>
             </w:pPr>
@@ -3205,7 +3190,6 @@
           </w:tcPr>
           <w:p>
             <w:pPr>
-              <w:spacing w:after="0"/>
               <w:ind w:right="43"/>
               <w:jc w:val="center"/>
             </w:pPr>
@@ -3229,7 +3213,7 @@
           </w:tcPr>
           <w:p>
             <w:pPr>
-              <w:spacing w:after="0" w:line="239" w:lineRule="auto"/>
+              <w:spacing w:line="239" w:lineRule="auto"/>
               <w:ind w:left="4"/>
             </w:pPr>
             <w:r>
@@ -3241,7 +3225,6 @@
           </w:p>
           <w:p>
             <w:pPr>
-              <w:spacing w:after="0"/>
               <w:ind w:left="4"/>
             </w:pPr>
             <w:r>
@@ -3270,7 +3253,6 @@
           </w:tcPr>
           <w:p>
             <w:pPr>
-              <w:spacing w:after="0"/>
               <w:ind w:right="52"/>
               <w:jc w:val="center"/>
             </w:pPr>
@@ -3295,7 +3277,6 @@
           </w:tcPr>
           <w:p>
             <w:pPr>
-              <w:spacing w:after="0"/>
               <w:ind w:right="49"/>
               <w:jc w:val="center"/>
             </w:pPr>
@@ -3320,7 +3301,6 @@
           </w:tcPr>
           <w:p>
             <w:pPr>
-              <w:spacing w:after="0"/>
               <w:ind w:right="43"/>
               <w:jc w:val="center"/>
             </w:pPr>
@@ -3344,7 +3324,7 @@
           </w:tcPr>
           <w:p>
             <w:pPr>
-              <w:spacing w:after="0" w:line="236" w:lineRule="auto"/>
+              <w:spacing w:line="236" w:lineRule="auto"/>
               <w:ind w:left="4"/>
             </w:pPr>
             <w:r>
@@ -3356,7 +3336,6 @@
           </w:p>
           <w:p>
             <w:pPr>
-              <w:spacing w:after="0"/>
               <w:ind w:left="4"/>
             </w:pPr>
             <w:r>
@@ -3385,7 +3364,6 @@
           </w:tcPr>
           <w:p>
             <w:pPr>
-              <w:spacing w:after="0"/>
               <w:ind w:right="49"/>
               <w:jc w:val="center"/>
             </w:pPr>
@@ -3410,7 +3388,6 @@
           </w:tcPr>
           <w:p>
             <w:pPr>
-              <w:spacing w:after="0"/>
               <w:ind w:right="49"/>
               <w:jc w:val="center"/>
             </w:pPr>
@@ -3435,7 +3412,6 @@
           </w:tcPr>
           <w:p>
             <w:pPr>
-              <w:spacing w:after="0"/>
               <w:ind w:right="43"/>
               <w:jc w:val="center"/>
             </w:pPr>
@@ -3471,7 +3447,6 @@
           </w:p>
           <w:p>
             <w:pPr>
-              <w:spacing w:after="0"/>
               <w:ind w:left="4"/>
             </w:pPr>
             <w:r>
@@ -3500,7 +3475,6 @@
           </w:tcPr>
           <w:p>
             <w:pPr>
-              <w:spacing w:after="0"/>
               <w:ind w:right="49"/>
               <w:jc w:val="center"/>
             </w:pPr>
@@ -3525,7 +3499,6 @@
           </w:tcPr>
           <w:p>
             <w:pPr>
-              <w:spacing w:after="0"/>
               <w:ind w:right="49"/>
               <w:jc w:val="center"/>
             </w:pPr>
@@ -3550,7 +3523,6 @@
           </w:tcPr>
           <w:p>
             <w:pPr>
-              <w:spacing w:after="0"/>
               <w:ind w:right="43"/>
               <w:jc w:val="center"/>
             </w:pPr>
@@ -3586,7 +3558,6 @@
           </w:p>
           <w:p>
             <w:pPr>
-              <w:spacing w:after="0"/>
               <w:ind w:left="4"/>
             </w:pPr>
             <w:r>
@@ -3615,7 +3586,6 @@
           </w:tcPr>
           <w:p>
             <w:pPr>
-              <w:spacing w:after="0"/>
               <w:ind w:right="51"/>
               <w:jc w:val="center"/>
             </w:pPr>
@@ -3640,7 +3610,6 @@
           </w:tcPr>
           <w:p>
             <w:pPr>
-              <w:spacing w:after="0"/>
               <w:ind w:right="49"/>
               <w:jc w:val="center"/>
             </w:pPr>
@@ -3665,7 +3634,6 @@
           </w:tcPr>
           <w:p>
             <w:pPr>
-              <w:spacing w:after="0"/>
               <w:ind w:right="43"/>
               <w:jc w:val="center"/>
             </w:pPr>
@@ -3701,7 +3669,6 @@
           </w:p>
           <w:p>
             <w:pPr>
-              <w:spacing w:after="0"/>
               <w:ind w:left="4"/>
             </w:pPr>
             <w:r>
@@ -3730,7 +3697,6 @@
           </w:tcPr>
           <w:p>
             <w:pPr>
-              <w:spacing w:after="0"/>
               <w:ind w:right="47"/>
               <w:jc w:val="center"/>
             </w:pPr>
@@ -3755,7 +3721,6 @@
           </w:tcPr>
           <w:p>
             <w:pPr>
-              <w:spacing w:after="0"/>
               <w:ind w:left="84"/>
             </w:pPr>
             <w:r>
@@ -3779,7 +3744,6 @@
           </w:tcPr>
           <w:p>
             <w:pPr>
-              <w:spacing w:after="0"/>
               <w:ind w:left="107"/>
             </w:pPr>
             <w:r>
@@ -3802,7 +3766,6 @@
           </w:tcPr>
           <w:p>
             <w:pPr>
-              <w:spacing w:after="0"/>
               <w:ind w:left="4"/>
             </w:pPr>
             <w:r>
@@ -3814,7 +3777,6 @@
           </w:p>
           <w:p>
             <w:pPr>
-              <w:spacing w:after="0"/>
               <w:ind w:left="4"/>
             </w:pPr>
             <w:r>
@@ -3826,7 +3788,6 @@
           </w:p>
           <w:p>
             <w:pPr>
-              <w:spacing w:after="0"/>
               <w:ind w:left="4"/>
             </w:pPr>
             <w:r>
@@ -3855,7 +3816,6 @@
           </w:tcPr>
           <w:p>
             <w:pPr>
-              <w:spacing w:after="0"/>
               <w:ind w:right="46"/>
               <w:jc w:val="center"/>
             </w:pPr>
@@ -3880,7 +3840,6 @@
           </w:tcPr>
           <w:p>
             <w:pPr>
-              <w:spacing w:after="0"/>
               <w:ind w:left="84"/>
             </w:pPr>
             <w:r>
@@ -3904,7 +3863,6 @@
           </w:tcPr>
           <w:p>
             <w:pPr>
-              <w:spacing w:after="0"/>
               <w:ind w:right="43"/>
               <w:jc w:val="center"/>
             </w:pPr>
@@ -3928,7 +3886,6 @@
           </w:tcPr>
           <w:p>
             <w:pPr>
-              <w:spacing w:after="0"/>
               <w:ind w:left="4"/>
             </w:pPr>
             <w:r>
@@ -3940,7 +3897,6 @@
           </w:p>
           <w:p>
             <w:pPr>
-              <w:spacing w:after="0"/>
               <w:ind w:left="4"/>
             </w:pPr>
             <w:r>
@@ -3952,7 +3908,6 @@
           </w:p>
           <w:p>
             <w:pPr>
-              <w:spacing w:after="0"/>
               <w:ind w:left="4"/>
             </w:pPr>
             <w:r>
@@ -3981,7 +3936,6 @@
           </w:tcPr>
           <w:p>
             <w:pPr>
-              <w:spacing w:after="0"/>
               <w:ind w:right="49"/>
               <w:jc w:val="center"/>
             </w:pPr>
@@ -4006,7 +3960,6 @@
           </w:tcPr>
           <w:p>
             <w:pPr>
-              <w:spacing w:after="0"/>
               <w:ind w:left="84"/>
             </w:pPr>
             <w:r>
@@ -4030,7 +3983,6 @@
           </w:tcPr>
           <w:p>
             <w:pPr>
-              <w:spacing w:after="0"/>
               <w:ind w:right="43"/>
               <w:jc w:val="center"/>
             </w:pPr>
@@ -4054,7 +4006,6 @@
           </w:tcPr>
           <w:p>
             <w:pPr>
-              <w:spacing w:after="0"/>
               <w:ind w:left="4"/>
             </w:pPr>
             <w:r>
@@ -4066,7 +4017,6 @@
           </w:p>
           <w:p>
             <w:pPr>
-              <w:spacing w:after="0"/>
               <w:ind w:left="4"/>
             </w:pPr>
             <w:r>
@@ -4078,7 +4028,6 @@
           </w:p>
           <w:p>
             <w:pPr>
-              <w:spacing w:after="0"/>
               <w:ind w:left="4"/>
             </w:pPr>
             <w:r>
@@ -4106,7 +4055,6 @@
           </w:tcPr>
           <w:p>
             <w:pPr>
-              <w:spacing w:after="0"/>
               <w:ind w:right="51"/>
               <w:jc w:val="center"/>
             </w:pPr>
@@ -4130,7 +4078,6 @@
           </w:tcPr>
           <w:p>
             <w:pPr>
-              <w:spacing w:after="0"/>
               <w:ind w:right="49"/>
               <w:jc w:val="center"/>
             </w:pPr>
@@ -4154,7 +4101,6 @@
           </w:tcPr>
           <w:p>
             <w:pPr>
-              <w:spacing w:after="0"/>
               <w:ind w:right="43"/>
               <w:jc w:val="center"/>
             </w:pPr>
@@ -4179,7 +4125,6 @@
           </w:tcPr>
           <w:p>
             <w:pPr>
-              <w:spacing w:after="0"/>
               <w:ind w:left="4"/>
               <w:jc w:val="center"/>
             </w:pPr>
@@ -4209,7 +4154,6 @@
           </w:tcPr>
           <w:p>
             <w:pPr>
-              <w:spacing w:after="0"/>
               <w:ind w:right="47"/>
               <w:jc w:val="center"/>
             </w:pPr>
@@ -4235,7 +4179,6 @@
           </w:tcPr>
           <w:p>
             <w:pPr>
-              <w:spacing w:after="0"/>
               <w:jc w:val="both"/>
             </w:pPr>
             <w:r>
@@ -4260,7 +4203,6 @@
           </w:tcPr>
           <w:p>
             <w:pPr>
-              <w:spacing w:after="0"/>
               <w:ind w:left="1"/>
               <w:jc w:val="both"/>
             </w:pPr>
@@ -4286,7 +4228,6 @@
           </w:tcPr>
           <w:p>
             <w:pPr>
-              <w:spacing w:after="0"/>
               <w:ind w:left="4"/>
               <w:jc w:val="center"/>
             </w:pPr>
@@ -4311,7 +4252,21 @@
           <w:rFonts w:ascii="Cambria" w:eastAsia="Cambria" w:hAnsi="Cambria" w:cs="Cambria"/>
           <w:b/>
         </w:rPr>
-        <w:t xml:space="preserve">Additional SDR Charges of 7.7% at the time of </w:t>
+        <w:t>Additional SDR Charges of 7.</w:t>
+      </w:r>
+      <w:r>
+        <w:rPr>
+          <w:rFonts w:ascii="Cambria" w:eastAsia="Cambria" w:hAnsi="Cambria" w:cs="Cambria"/>
+          <w:b/>
+        </w:rPr>
+        <w:t>6</w:t>
+      </w:r>
+      <w:r>
+        <w:rPr>
+          <w:rFonts w:ascii="Cambria" w:eastAsia="Cambria" w:hAnsi="Cambria" w:cs="Cambria"/>
+          <w:b/>
+        </w:rPr>
+        <w:t xml:space="preserve">% at the time of </w:t>
       </w:r>
     </w:p>
     <w:p>
@@ -4408,7 +4363,25 @@
           <w:b/>
           <w:i/>
         </w:rPr>
-        <w:t xml:space="preserve">* This illustration is for representation purposes only. The actual calculation and monthly payout may vary depending on the (i) unit selected (ii) </w:t>
+        <w:t>* This illustration is for representation purposes only. The actual calculation and monthly payout may vary depending on the (</w:t>
+      </w:r>
+      <w:proofErr w:type="spellStart"/>
+      <w:r>
+        <w:rPr>
+          <w:rFonts w:ascii="Cambria" w:eastAsia="Cambria" w:hAnsi="Cambria" w:cs="Cambria"/>
+          <w:b/>
+          <w:i/>
+        </w:rPr>
+        <w:t>i</w:t>
+      </w:r>
+      <w:proofErr w:type="spellEnd"/>
+      <w:r>
+        <w:rPr>
+          <w:rFonts w:ascii="Cambria" w:eastAsia="Cambria" w:hAnsi="Cambria" w:cs="Cambria"/>
+          <w:b/>
+          <w:i/>
+        </w:rPr>
+        <w:t xml:space="preserve">) unit selected (ii) </w:t>
       </w:r>
     </w:p>
     <w:p>
@@ -4542,7 +4515,25 @@
             <w:color w:val="0000FF"/>
             <w:u w:val="single" w:color="0000FF"/>
           </w:rPr>
-          <w:t>Godrej Parkshire, Bangalore</w:t>
+          <w:t xml:space="preserve">Godrej </w:t>
+        </w:r>
+        <w:proofErr w:type="spellStart"/>
+        <w:r>
+          <w:rPr>
+            <w:rFonts w:ascii="Cambria" w:eastAsia="Cambria" w:hAnsi="Cambria" w:cs="Cambria"/>
+            <w:color w:val="0000FF"/>
+            <w:u w:val="single" w:color="0000FF"/>
+          </w:rPr>
+          <w:t>Parkshire</w:t>
+        </w:r>
+        <w:proofErr w:type="spellEnd"/>
+        <w:r>
+          <w:rPr>
+            <w:rFonts w:ascii="Cambria" w:eastAsia="Cambria" w:hAnsi="Cambria" w:cs="Cambria"/>
+            <w:color w:val="0000FF"/>
+            <w:u w:val="single" w:color="0000FF"/>
+          </w:rPr>
+          <w:t>, Bangalore</w:t>
         </w:r>
       </w:hyperlink>
       <w:hyperlink r:id="rId13">
@@ -5472,7 +5463,21 @@
         <w:rPr>
           <w:rFonts w:ascii="Cambria" w:eastAsia="Cambria" w:hAnsi="Cambria" w:cs="Cambria"/>
         </w:rPr>
-        <w:t xml:space="preserve"> (Namma Metro) – 22 mins*  </w:t>
+        <w:t xml:space="preserve"> (</w:t>
+      </w:r>
+      <w:proofErr w:type="spellStart"/>
+      <w:r>
+        <w:rPr>
+          <w:rFonts w:ascii="Cambria" w:eastAsia="Cambria" w:hAnsi="Cambria" w:cs="Cambria"/>
+        </w:rPr>
+        <w:t>Namma</w:t>
+      </w:r>
+      <w:proofErr w:type="spellEnd"/>
+      <w:r>
+        <w:rPr>
+          <w:rFonts w:ascii="Cambria" w:eastAsia="Cambria" w:hAnsi="Cambria" w:cs="Cambria"/>
+        </w:rPr>
+        <w:t xml:space="preserve"> Metro) – 22 mins*  </w:t>
       </w:r>
     </w:p>
     <w:p>
@@ -5507,12 +5512,21 @@
         <w:spacing w:after="3" w:line="265" w:lineRule="auto"/>
         <w:ind w:hanging="360"/>
       </w:pPr>
+      <w:proofErr w:type="spellStart"/>
       <w:r>
         <w:rPr>
           <w:rFonts w:ascii="Cambria" w:eastAsia="Cambria" w:hAnsi="Cambria" w:cs="Cambria"/>
           <w:b/>
         </w:rPr>
-        <w:t>Kempegowda International Airport</w:t>
+        <w:t>Kempegowda</w:t>
+      </w:r>
+      <w:proofErr w:type="spellEnd"/>
+      <w:r>
+        <w:rPr>
+          <w:rFonts w:ascii="Cambria" w:eastAsia="Cambria" w:hAnsi="Cambria" w:cs="Cambria"/>
+          <w:b/>
+        </w:rPr>
+        <w:t xml:space="preserve"> International Airport</w:t>
       </w:r>
       <w:r>
         <w:rPr>
@@ -6238,8 +6252,17 @@
           <w:rFonts w:ascii="Cambria" w:eastAsia="Cambria" w:hAnsi="Cambria" w:cs="Cambria"/>
           <w:b/>
         </w:rPr>
-        <w:t>Phoenix Marketcity</w:t>
-      </w:r>
+        <w:t xml:space="preserve">Phoenix </w:t>
+      </w:r>
+      <w:proofErr w:type="spellStart"/>
+      <w:r>
+        <w:rPr>
+          <w:rFonts w:ascii="Cambria" w:eastAsia="Cambria" w:hAnsi="Cambria" w:cs="Cambria"/>
+          <w:b/>
+        </w:rPr>
+        <w:t>Marketcity</w:t>
+      </w:r>
+      <w:proofErr w:type="spellEnd"/>
       <w:r>
         <w:rPr>
           <w:rFonts w:ascii="Cambria" w:eastAsia="Cambria" w:hAnsi="Cambria" w:cs="Cambria"/>
@@ -6844,12 +6867,21 @@
         <w:spacing w:after="3" w:line="265" w:lineRule="auto"/>
         <w:ind w:hanging="360"/>
       </w:pPr>
+      <w:proofErr w:type="spellStart"/>
       <w:r>
         <w:rPr>
           <w:rFonts w:ascii="Cambria" w:eastAsia="Cambria" w:hAnsi="Cambria" w:cs="Cambria"/>
           <w:b/>
         </w:rPr>
-        <w:t>Bearys Global Research Triangle</w:t>
+        <w:t>Bearys</w:t>
+      </w:r>
+      <w:proofErr w:type="spellEnd"/>
+      <w:r>
+        <w:rPr>
+          <w:rFonts w:ascii="Cambria" w:eastAsia="Cambria" w:hAnsi="Cambria" w:cs="Cambria"/>
+          <w:b/>
+        </w:rPr>
+        <w:t xml:space="preserve"> Global Research Triangle</w:t>
       </w:r>
       <w:r>
         <w:rPr>
@@ -6959,12 +6991,21 @@
         <w:spacing w:after="3" w:line="265" w:lineRule="auto"/>
         <w:ind w:hanging="360"/>
       </w:pPr>
+      <w:proofErr w:type="spellStart"/>
       <w:r>
         <w:rPr>
           <w:rFonts w:ascii="Cambria" w:eastAsia="Cambria" w:hAnsi="Cambria" w:cs="Cambria"/>
           <w:b/>
         </w:rPr>
-        <w:t>Bagmane World Technology Centre</w:t>
+        <w:t>Bagmane</w:t>
+      </w:r>
+      <w:proofErr w:type="spellEnd"/>
+      <w:r>
+        <w:rPr>
+          <w:rFonts w:ascii="Cambria" w:eastAsia="Cambria" w:hAnsi="Cambria" w:cs="Cambria"/>
+          <w:b/>
+        </w:rPr>
+        <w:t xml:space="preserve"> World Technology Centre</w:t>
       </w:r>
       <w:r>
         <w:rPr>
@@ -7617,12 +7658,21 @@
         <w:spacing w:after="3" w:line="265" w:lineRule="auto"/>
         <w:ind w:hanging="360"/>
       </w:pPr>
+      <w:proofErr w:type="spellStart"/>
       <w:r>
         <w:rPr>
           <w:rFonts w:ascii="Cambria" w:eastAsia="Cambria" w:hAnsi="Cambria" w:cs="Cambria"/>
           <w:b/>
         </w:rPr>
-        <w:t>Winmore Academy</w:t>
+        <w:t>Winmore</w:t>
+      </w:r>
+      <w:proofErr w:type="spellEnd"/>
+      <w:r>
+        <w:rPr>
+          <w:rFonts w:ascii="Cambria" w:eastAsia="Cambria" w:hAnsi="Cambria" w:cs="Cambria"/>
+          <w:b/>
+        </w:rPr>
+        <w:t xml:space="preserve"> Academy</w:t>
       </w:r>
       <w:r>
         <w:rPr>
@@ -8366,12 +8416,21 @@
         <w:spacing w:after="3" w:line="265" w:lineRule="auto"/>
         <w:ind w:hanging="360"/>
       </w:pPr>
+      <w:proofErr w:type="spellStart"/>
       <w:r>
         <w:rPr>
           <w:rFonts w:ascii="Cambria" w:eastAsia="Cambria" w:hAnsi="Cambria" w:cs="Cambria"/>
           <w:b/>
         </w:rPr>
-        <w:t>Siliconcity Hospital</w:t>
+        <w:t>Siliconcity</w:t>
+      </w:r>
+      <w:proofErr w:type="spellEnd"/>
+      <w:r>
+        <w:rPr>
+          <w:rFonts w:ascii="Cambria" w:eastAsia="Cambria" w:hAnsi="Cambria" w:cs="Cambria"/>
+          <w:b/>
+        </w:rPr>
+        <w:t xml:space="preserve"> Hospital</w:t>
       </w:r>
       <w:r>
         <w:rPr>
@@ -10780,12 +10839,21 @@
         </w:rPr>
         <w:t xml:space="preserve">Connectivity to </w:t>
       </w:r>
+      <w:proofErr w:type="spellStart"/>
       <w:r>
         <w:rPr>
           <w:rFonts w:ascii="Cambria" w:eastAsia="Cambria" w:hAnsi="Cambria" w:cs="Cambria"/>
           <w:b/>
         </w:rPr>
-        <w:t>Namma Metro</w:t>
+        <w:t>Namma</w:t>
+      </w:r>
+      <w:proofErr w:type="spellEnd"/>
+      <w:r>
+        <w:rPr>
+          <w:rFonts w:ascii="Cambria" w:eastAsia="Cambria" w:hAnsi="Cambria" w:cs="Cambria"/>
+          <w:b/>
+        </w:rPr>
+        <w:t xml:space="preserve"> Metro</w:t>
       </w:r>
       <w:r>
         <w:rPr>
@@ -10809,12 +10877,21 @@
         </w:rPr>
         <w:t xml:space="preserve">Improved access to </w:t>
       </w:r>
+      <w:proofErr w:type="spellStart"/>
       <w:r>
         <w:rPr>
           <w:rFonts w:ascii="Cambria" w:eastAsia="Cambria" w:hAnsi="Cambria" w:cs="Cambria"/>
           <w:b/>
         </w:rPr>
-        <w:t>Kempegowda International Airport</w:t>
+        <w:t>Kempegowda</w:t>
+      </w:r>
+      <w:proofErr w:type="spellEnd"/>
+      <w:r>
+        <w:rPr>
+          <w:rFonts w:ascii="Cambria" w:eastAsia="Cambria" w:hAnsi="Cambria" w:cs="Cambria"/>
+          <w:b/>
+        </w:rPr>
+        <w:t xml:space="preserve"> International Airport</w:t>
       </w:r>
       <w:r>
         <w:rPr>
@@ -13591,7 +13668,25 @@
           <w:b/>
           <w:sz w:val="24"/>
         </w:rPr>
-        <w:t>Compared to Budigere / Old Madras Road belt:</w:t>
+        <w:t xml:space="preserve">Compared to </w:t>
+      </w:r>
+      <w:proofErr w:type="spellStart"/>
+      <w:r>
+        <w:rPr>
+          <w:rFonts w:ascii="Times New Roman" w:eastAsia="Times New Roman" w:hAnsi="Times New Roman"/>
+          <w:b/>
+          <w:sz w:val="24"/>
+        </w:rPr>
+        <w:t>Budigere</w:t>
+      </w:r>
+      <w:proofErr w:type="spellEnd"/>
+      <w:r>
+        <w:rPr>
+          <w:rFonts w:ascii="Times New Roman" w:eastAsia="Times New Roman" w:hAnsi="Times New Roman"/>
+          <w:b/>
+          <w:sz w:val="24"/>
+        </w:rPr>
+        <w:t xml:space="preserve"> / Old Madras Road belt:</w:t>
       </w:r>
       <w:r>
         <w:rPr>
@@ -13724,7 +13819,35 @@
         <w:rPr>
           <w:rFonts w:ascii="Cambria" w:eastAsia="Cambria" w:hAnsi="Cambria" w:cs="Cambria"/>
         </w:rPr>
-        <w:t xml:space="preserve">Godrej Parkshire is located in </w:t>
+        <w:t xml:space="preserve">Godrej </w:t>
+      </w:r>
+      <w:proofErr w:type="spellStart"/>
+      <w:r>
+        <w:rPr>
+          <w:rFonts w:ascii="Cambria" w:eastAsia="Cambria" w:hAnsi="Cambria" w:cs="Cambria"/>
+        </w:rPr>
+        <w:t>Parkshire</w:t>
+      </w:r>
+      <w:proofErr w:type="spellEnd"/>
+      <w:r>
+        <w:rPr>
+          <w:rFonts w:ascii="Cambria" w:eastAsia="Cambria" w:hAnsi="Cambria" w:cs="Cambria"/>
+        </w:rPr>
+        <w:t xml:space="preserve"> </w:t>
+      </w:r>
+      <w:proofErr w:type="gramStart"/>
+      <w:r>
+        <w:rPr>
+          <w:rFonts w:ascii="Cambria" w:eastAsia="Cambria" w:hAnsi="Cambria" w:cs="Cambria"/>
+        </w:rPr>
+        <w:t>is located in</w:t>
+      </w:r>
+      <w:proofErr w:type="gramEnd"/>
+      <w:r>
+        <w:rPr>
+          <w:rFonts w:ascii="Cambria" w:eastAsia="Cambria" w:hAnsi="Cambria" w:cs="Cambria"/>
+        </w:rPr>
+        <w:t xml:space="preserve"> </w:t>
       </w:r>
       <w:r>
         <w:rPr>
@@ -15889,7 +16012,21 @@
         <w:rPr>
           <w:rFonts w:ascii="Cambria" w:eastAsia="Cambria" w:hAnsi="Cambria" w:cs="Cambria"/>
         </w:rPr>
-        <w:t xml:space="preserve">20 min from whitefield  </w:t>
+        <w:t xml:space="preserve">20 min from </w:t>
+      </w:r>
+      <w:proofErr w:type="spellStart"/>
+      <w:r>
+        <w:rPr>
+          <w:rFonts w:ascii="Cambria" w:eastAsia="Cambria" w:hAnsi="Cambria" w:cs="Cambria"/>
+        </w:rPr>
+        <w:t>whitefield</w:t>
+      </w:r>
+      <w:proofErr w:type="spellEnd"/>
+      <w:r>
+        <w:rPr>
+          <w:rFonts w:ascii="Cambria" w:eastAsia="Cambria" w:hAnsi="Cambria" w:cs="Cambria"/>
+        </w:rPr>
+        <w:t xml:space="preserve">  </w:t>
       </w:r>
     </w:p>
     <w:p>
@@ -15913,11 +16050,19 @@
         <w:spacing w:after="248" w:line="265" w:lineRule="auto"/>
         <w:ind w:left="10" w:hanging="10"/>
       </w:pPr>
-      <w:r>
-        <w:rPr>
-          <w:rFonts w:ascii="Cambria" w:eastAsia="Cambria" w:hAnsi="Cambria" w:cs="Cambria"/>
-        </w:rPr>
-        <w:t xml:space="preserve">Yes its available </w:t>
+      <w:proofErr w:type="gramStart"/>
+      <w:r>
+        <w:rPr>
+          <w:rFonts w:ascii="Cambria" w:eastAsia="Cambria" w:hAnsi="Cambria" w:cs="Cambria"/>
+        </w:rPr>
+        <w:t>Yes</w:t>
+      </w:r>
+      <w:proofErr w:type="gramEnd"/>
+      <w:r>
+        <w:rPr>
+          <w:rFonts w:ascii="Cambria" w:eastAsia="Cambria" w:hAnsi="Cambria" w:cs="Cambria"/>
+        </w:rPr>
+        <w:t xml:space="preserve"> its available </w:t>
       </w:r>
     </w:p>
     <w:p>
@@ -18184,7 +18329,21 @@
         <w:rPr>
           <w:rFonts w:ascii="Cambria" w:eastAsia="Cambria" w:hAnsi="Cambria" w:cs="Cambria"/>
         </w:rPr>
-        <w:t xml:space="preserve">Is the 1% plan really beneficial?  </w:t>
+        <w:t xml:space="preserve">Is the 1% plan </w:t>
+      </w:r>
+      <w:proofErr w:type="gramStart"/>
+      <w:r>
+        <w:rPr>
+          <w:rFonts w:ascii="Cambria" w:eastAsia="Cambria" w:hAnsi="Cambria" w:cs="Cambria"/>
+        </w:rPr>
+        <w:t>really beneficial</w:t>
+      </w:r>
+      <w:proofErr w:type="gramEnd"/>
+      <w:r>
+        <w:rPr>
+          <w:rFonts w:ascii="Cambria" w:eastAsia="Cambria" w:hAnsi="Cambria" w:cs="Cambria"/>
+        </w:rPr>
+        <w:t xml:space="preserve">?  </w:t>
       </w:r>
     </w:p>
     <w:p>
@@ -19008,7 +19167,23 @@
           <w:rFonts w:ascii="Cambria" w:eastAsia="Cambria" w:hAnsi="Cambria" w:cs="Cambria"/>
           <w:color w:val="222222"/>
         </w:rPr>
-        <w:t xml:space="preserve">Address: Godrej Parkshire, SY NO 36/1, 36/2, 36/3, 36/4A1, 36/4A2, 36/4B1, 36/4B2, 36/5, 36/6, 36/7, 36/8, </w:t>
+        <w:t xml:space="preserve">Address: Godrej </w:t>
+      </w:r>
+      <w:proofErr w:type="spellStart"/>
+      <w:r>
+        <w:rPr>
+          <w:rFonts w:ascii="Cambria" w:eastAsia="Cambria" w:hAnsi="Cambria" w:cs="Cambria"/>
+          <w:color w:val="222222"/>
+        </w:rPr>
+        <w:t>Parkshire</w:t>
+      </w:r>
+      <w:proofErr w:type="spellEnd"/>
+      <w:r>
+        <w:rPr>
+          <w:rFonts w:ascii="Cambria" w:eastAsia="Cambria" w:hAnsi="Cambria" w:cs="Cambria"/>
+          <w:color w:val="222222"/>
+        </w:rPr>
+        <w:t xml:space="preserve">, SY NO 36/1, 36/2, 36/3, 36/4A1, 36/4A2, 36/4B1, 36/4B2, 36/5, 36/6, 36/7, 36/8, </w:t>
       </w:r>
     </w:p>
     <w:p>
@@ -19021,7 +19196,87 @@
           <w:rFonts w:ascii="Cambria" w:eastAsia="Cambria" w:hAnsi="Cambria" w:cs="Cambria"/>
           <w:color w:val="222222"/>
         </w:rPr>
-        <w:t xml:space="preserve">36/9, 66/1, 66/2, 66/3, 67/1A1, 67/1A2, 67/1A3, 67/1B1, 67/1B2, 67/1B3 67/2, 67/3, 67/4, 68/1, 68/2, 68/3, 68/4 AND 68/5 Sarkariguttahalli Village, Kasaba Hobli, Hosakote, Bengaluru Rural, Karnataka - 562114. The project is registered as Godrej Parkshire. </w:t>
+        <w:t xml:space="preserve">36/9, 66/1, 66/2, 66/3, 67/1A1, 67/1A2, 67/1A3, 67/1B1, 67/1B2, 67/1B3 67/2, 67/3, 67/4, 68/1, 68/2, 68/3, 68/4 AND 68/5 </w:t>
+      </w:r>
+      <w:proofErr w:type="spellStart"/>
+      <w:r>
+        <w:rPr>
+          <w:rFonts w:ascii="Cambria" w:eastAsia="Cambria" w:hAnsi="Cambria" w:cs="Cambria"/>
+          <w:color w:val="222222"/>
+        </w:rPr>
+        <w:t>Sarkariguttahalli</w:t>
+      </w:r>
+      <w:proofErr w:type="spellEnd"/>
+      <w:r>
+        <w:rPr>
+          <w:rFonts w:ascii="Cambria" w:eastAsia="Cambria" w:hAnsi="Cambria" w:cs="Cambria"/>
+          <w:color w:val="222222"/>
+        </w:rPr>
+        <w:t xml:space="preserve"> Village, </w:t>
+      </w:r>
+      <w:proofErr w:type="spellStart"/>
+      <w:r>
+        <w:rPr>
+          <w:rFonts w:ascii="Cambria" w:eastAsia="Cambria" w:hAnsi="Cambria" w:cs="Cambria"/>
+          <w:color w:val="222222"/>
+        </w:rPr>
+        <w:t>Kasaba</w:t>
+      </w:r>
+      <w:proofErr w:type="spellEnd"/>
+      <w:r>
+        <w:rPr>
+          <w:rFonts w:ascii="Cambria" w:eastAsia="Cambria" w:hAnsi="Cambria" w:cs="Cambria"/>
+          <w:color w:val="222222"/>
+        </w:rPr>
+        <w:t xml:space="preserve"> </w:t>
+      </w:r>
+      <w:proofErr w:type="spellStart"/>
+      <w:r>
+        <w:rPr>
+          <w:rFonts w:ascii="Cambria" w:eastAsia="Cambria" w:hAnsi="Cambria" w:cs="Cambria"/>
+          <w:color w:val="222222"/>
+        </w:rPr>
+        <w:t>Hobli</w:t>
+      </w:r>
+      <w:proofErr w:type="spellEnd"/>
+      <w:r>
+        <w:rPr>
+          <w:rFonts w:ascii="Cambria" w:eastAsia="Cambria" w:hAnsi="Cambria" w:cs="Cambria"/>
+          <w:color w:val="222222"/>
+        </w:rPr>
+        <w:t xml:space="preserve">, </w:t>
+      </w:r>
+      <w:proofErr w:type="spellStart"/>
+      <w:r>
+        <w:rPr>
+          <w:rFonts w:ascii="Cambria" w:eastAsia="Cambria" w:hAnsi="Cambria" w:cs="Cambria"/>
+          <w:color w:val="222222"/>
+        </w:rPr>
+        <w:t>Hosakote</w:t>
+      </w:r>
+      <w:proofErr w:type="spellEnd"/>
+      <w:r>
+        <w:rPr>
+          <w:rFonts w:ascii="Cambria" w:eastAsia="Cambria" w:hAnsi="Cambria" w:cs="Cambria"/>
+          <w:color w:val="222222"/>
+        </w:rPr>
+        <w:t xml:space="preserve">, Bengaluru Rural, Karnataka - 562114. The project is registered as Godrej </w:t>
+      </w:r>
+      <w:proofErr w:type="spellStart"/>
+      <w:r>
+        <w:rPr>
+          <w:rFonts w:ascii="Cambria" w:eastAsia="Cambria" w:hAnsi="Cambria" w:cs="Cambria"/>
+          <w:color w:val="222222"/>
+        </w:rPr>
+        <w:t>Parkshire</w:t>
+      </w:r>
+      <w:proofErr w:type="spellEnd"/>
+      <w:r>
+        <w:rPr>
+          <w:rFonts w:ascii="Cambria" w:eastAsia="Cambria" w:hAnsi="Cambria" w:cs="Cambria"/>
+          <w:color w:val="222222"/>
+        </w:rPr>
+        <w:t xml:space="preserve">. </w:t>
       </w:r>
     </w:p>
     <w:p>
@@ -19077,7 +19332,39 @@
           <w:color w:val="222222"/>
         </w:rPr>
         <w:lastRenderedPageBreak/>
-        <w:t>Karnataka RERA website shall be final and binding on the Developer and Purchaser. Recipients are advised to apprise themselves of the necessary and relevant information of the Project prior to making any purchase decisions. *This refers to the payment plan offer. Please refer to payment terms as mentioned in the AFS. Basis sole discretion of the developer. Limited time period offer. Date of publication 14th April, 2026. T&amp;C Apply</w:t>
+        <w:t xml:space="preserve">Karnataka RERA website shall be final and binding on the Developer and Purchaser. Recipients are advised to apprise themselves of the necessary and relevant information of the Project prior to making any purchase decisions. *This refers to the payment plan offer. Please refer to payment terms as mentioned in the AFS. Basis sole discretion of the developer. Limited </w:t>
+      </w:r>
+      <w:proofErr w:type="gramStart"/>
+      <w:r>
+        <w:rPr>
+          <w:rFonts w:ascii="Cambria" w:eastAsia="Cambria" w:hAnsi="Cambria" w:cs="Cambria"/>
+          <w:color w:val="222222"/>
+        </w:rPr>
+        <w:t>time period</w:t>
+      </w:r>
+      <w:proofErr w:type="gramEnd"/>
+      <w:r>
+        <w:rPr>
+          <w:rFonts w:ascii="Cambria" w:eastAsia="Cambria" w:hAnsi="Cambria" w:cs="Cambria"/>
+          <w:color w:val="222222"/>
+        </w:rPr>
+        <w:t xml:space="preserve"> offer. Date of publication 14th </w:t>
+      </w:r>
+      <w:proofErr w:type="gramStart"/>
+      <w:r>
+        <w:rPr>
+          <w:rFonts w:ascii="Cambria" w:eastAsia="Cambria" w:hAnsi="Cambria" w:cs="Cambria"/>
+          <w:color w:val="222222"/>
+        </w:rPr>
+        <w:t>April,</w:t>
+      </w:r>
+      <w:proofErr w:type="gramEnd"/>
+      <w:r>
+        <w:rPr>
+          <w:rFonts w:ascii="Cambria" w:eastAsia="Cambria" w:hAnsi="Cambria" w:cs="Cambria"/>
+          <w:color w:val="222222"/>
+        </w:rPr>
+        <w:t xml:space="preserve"> 2026. T&amp;C Apply</w:t>
       </w:r>
       <w:r>
         <w:rPr>
@@ -19217,7 +19504,6 @@
               <v:path gradientshapeok="t" o:connecttype="rect"/>
             </v:shapetype>
             <v:shape id="Text Box 174" o:spid="_x0000_s1026" type="#_x0000_t202" alt="Cisco Confidential" style="position:absolute;margin-left:32.95pt;margin-top:0;width:84.15pt;height:25.55pt;z-index:251659264;visibility:visible;mso-wrap-style:none;mso-wrap-distance-left:0;mso-wrap-distance-top:0;mso-wrap-distance-right:0;mso-wrap-distance-bottom:0;mso-position-horizontal:right;mso-position-horizontal-relative:page;mso-position-vertical:bottom;mso-position-vertical-relative:page;v-text-anchor:bottom" o:gfxdata="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" filled="f" stroked="f">
-              <v:fill o:detectmouseclick="t"/>
               <v:textbox style="mso-fit-shape-to-text:t" inset="0,0,20pt,15pt">
                 <w:txbxContent>
                   <w:p>
@@ -19344,7 +19630,6 @@
               <v:path gradientshapeok="t" o:connecttype="rect"/>
             </v:shapetype>
             <v:shape id="Text Box 175" o:spid="_x0000_s1027" type="#_x0000_t202" alt="Cisco Confidential" style="position:absolute;margin-left:32.95pt;margin-top:0;width:84.15pt;height:25.55pt;z-index:251660288;visibility:visible;mso-wrap-style:none;mso-wrap-distance-left:0;mso-wrap-distance-top:0;mso-wrap-distance-right:0;mso-wrap-distance-bottom:0;mso-position-horizontal:right;mso-position-horizontal-relative:page;mso-position-vertical:bottom;mso-position-vertical-relative:page;v-text-anchor:bottom" o:gfxdata="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" filled="f" stroked="f">
-              <v:fill o:detectmouseclick="t"/>
               <v:textbox style="mso-fit-shape-to-text:t" inset="0,0,20pt,15pt">
                 <w:txbxContent>
                   <w:p>
@@ -19471,7 +19756,6 @@
               <v:path gradientshapeok="t" o:connecttype="rect"/>
             </v:shapetype>
             <v:shape id="Text Box 173" o:spid="_x0000_s1028" type="#_x0000_t202" alt="Cisco Confidential" style="position:absolute;margin-left:32.95pt;margin-top:0;width:84.15pt;height:25.55pt;z-index:251658240;visibility:visible;mso-wrap-style:none;mso-wrap-distance-left:0;mso-wrap-distance-top:0;mso-wrap-distance-right:0;mso-wrap-distance-bottom:0;mso-position-horizontal:right;mso-position-horizontal-relative:page;mso-position-vertical:bottom;mso-position-vertical-relative:page;v-text-anchor:bottom" o:gfxdata="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" filled="f" stroked="f">
-              <v:fill o:detectmouseclick="t"/>
               <v:textbox style="mso-fit-shape-to-text:t" inset="0,0,20pt,15pt">
                 <w:txbxContent>
                   <w:p>

</xml_diff>